<commit_message>
update CV and index.html
</commit_message>
<xml_diff>
--- a/CV.docx
+++ b/CV.docx
@@ -42,7 +42,7 @@
         <w:jc w:val="center"/>
       </w:pPr>
       <w:r>
-        <w:t xml:space="preserve">Abu Dhabi, UAE  |  </w:t>
+        <w:t xml:space="preserve">Mysore, Karnataka, India  |  </w:t>
       </w:r>
       <w:hyperlink r:id="rId8">
         <w:r>
@@ -66,11 +66,11 @@
             <w:color w:val="0563C1"/>
             <w:u w:val="single"/>
           </w:rPr>
-          <w:t>+971 52 824 4883</w:t>
+          <w:t>+91 89511 16881</w:t>
         </w:r>
       </w:hyperlink>
       <w:r>
-        <w:t xml:space="preserve">UAE: +971 52 824 4883  |  India: </w:t>
+        <w:t xml:space="preserve">India: +91 89511 16881  |  </w:t>
       </w:r>
       <w:hyperlink r:id="rId10">
         <w:r>

</xml_diff>